<commit_message>
Création de de deux fichiers Feature et Modèle
</commit_message>
<xml_diff>
--- a/DOC/REGLE FACTURE.docx
+++ b/DOC/REGLE FACTURE.docx
@@ -19,7 +19,23 @@
           <w:rFonts w:ascii="Times New Roman" w:eastAsia="Times New Roman" w:hAnsi="Times New Roman" w:cs="Times New Roman"/>
           <w:lang w:eastAsia="fr-FR"/>
         </w:rPr>
-        <w:t>Règles BLOQUANTES (Hard rules → rejet automatique)</w:t>
+        <w:t xml:space="preserve">Règles BLOQUANTES (Hard </w:t>
+      </w:r>
+      <w:proofErr w:type="spellStart"/>
+      <w:r>
+        <w:rPr>
+          <w:rFonts w:ascii="Times New Roman" w:eastAsia="Times New Roman" w:hAnsi="Times New Roman" w:cs="Times New Roman"/>
+          <w:lang w:eastAsia="fr-FR"/>
+        </w:rPr>
+        <w:t>rules</w:t>
+      </w:r>
+      <w:proofErr w:type="spellEnd"/>
+      <w:r>
+        <w:rPr>
+          <w:rFonts w:ascii="Times New Roman" w:eastAsia="Times New Roman" w:hAnsi="Times New Roman" w:cs="Times New Roman"/>
+          <w:lang w:eastAsia="fr-FR"/>
+        </w:rPr>
+        <w:t xml:space="preserve"> → rejet automatique)</w:t>
       </w:r>
     </w:p>
     <w:p>
@@ -1105,7 +1121,21 @@
         <w:rPr>
           <w:rFonts w:eastAsia="Times New Roman"/>
         </w:rPr>
-        <w:t>B. Règles de COHÉRENCE (Soft rules → score de risque)</w:t>
+        <w:t xml:space="preserve">B. Règles de COHÉRENCE (Soft </w:t>
+      </w:r>
+      <w:proofErr w:type="spellStart"/>
+      <w:r>
+        <w:rPr>
+          <w:rFonts w:eastAsia="Times New Roman"/>
+        </w:rPr>
+        <w:t>rules</w:t>
+      </w:r>
+      <w:proofErr w:type="spellEnd"/>
+      <w:r>
+        <w:rPr>
+          <w:rFonts w:eastAsia="Times New Roman"/>
+        </w:rPr>
+        <w:t xml:space="preserve"> → score de risque)</w:t>
       </w:r>
     </w:p>
     <w:p>
@@ -1789,7 +1819,21 @@
         <w:rPr>
           <w:rFonts w:eastAsia="Times New Roman"/>
         </w:rPr>
-        <w:t>C. Règles INFORMATIONNELLES (Audit / explicabilité)</w:t>
+        <w:t xml:space="preserve">C. Règles INFORMATIONNELLES (Audit / </w:t>
+      </w:r>
+      <w:proofErr w:type="spellStart"/>
+      <w:r>
+        <w:rPr>
+          <w:rFonts w:eastAsia="Times New Roman"/>
+        </w:rPr>
+        <w:t>explicabilité</w:t>
+      </w:r>
+      <w:proofErr w:type="spellEnd"/>
+      <w:r>
+        <w:rPr>
+          <w:rFonts w:eastAsia="Times New Roman"/>
+        </w:rPr>
+        <w:t>)</w:t>
       </w:r>
     </w:p>
     <w:tbl>
@@ -2086,7 +2130,15 @@
         <w:spacing w:before="100" w:beforeAutospacing="1" w:after="100" w:afterAutospacing="1"/>
       </w:pPr>
       <w:r>
-        <w:t xml:space="preserve">Ces features peuvent être calculées </w:t>
+        <w:t xml:space="preserve">Ces </w:t>
+      </w:r>
+      <w:proofErr w:type="spellStart"/>
+      <w:r>
+        <w:t>features</w:t>
+      </w:r>
+      <w:proofErr w:type="spellEnd"/>
+      <w:r>
+        <w:t xml:space="preserve"> peuvent être calculées </w:t>
       </w:r>
       <w:r>
         <w:rPr>
@@ -11380,6 +11432,7 @@
             <w:r>
               <w:rPr>
                 <w:rFonts w:eastAsia="Times New Roman"/>
+                <w:highlight w:val="yellow"/>
               </w:rPr>
               <w:t>verifierCompletude</w:t>
             </w:r>
@@ -11716,19 +11769,7 @@
               <w:rPr>
                 <w:rFonts w:eastAsia="Times New Roman"/>
               </w:rPr>
-              <w:t xml:space="preserve"> '</w:t>
-            </w:r>
-            <w:r>
-              <w:rPr>
-                <w:rFonts w:eastAsia="Times New Roman"/>
-              </w:rPr>
-              <w:t>fe</w:t>
-            </w:r>
-            <w:r>
-              <w:rPr>
-                <w:rFonts w:eastAsia="Times New Roman"/>
-              </w:rPr>
-              <w:t xml:space="preserve">male')  et si </w:t>
+              <w:t xml:space="preserve"> 'female')  et si </w:t>
             </w:r>
             <w:r>
               <w:rPr>
@@ -12001,10 +12042,13 @@
             <w:r>
               <w:rPr>
                 <w:rFonts w:eastAsia="Times New Roman"/>
+                <w:highlight w:val="yellow"/>
               </w:rPr>
               <w:lastRenderedPageBreak/>
               <w:t>verifierHospitalisation</w:t>
             </w:r>
+            <w:bookmarkStart w:id="0" w:name="_GoBack"/>
+            <w:bookmarkEnd w:id="0"/>
           </w:p>
         </w:tc>
         <w:tc>
@@ -12122,24 +12166,18 @@
               <w:rPr>
                 <w:rFonts w:eastAsia="Times New Roman"/>
               </w:rPr>
+              <w:t xml:space="preserve"> consultation_type</w:t>
+            </w:r>
+            <w:r>
+              <w:rPr>
+                <w:rFonts w:eastAsia="Times New Roman"/>
+              </w:rPr>
               <w:t xml:space="preserve"> </w:t>
             </w:r>
             <w:r>
               <w:rPr>
                 <w:rFonts w:eastAsia="Times New Roman"/>
               </w:rPr>
-              <w:t>consultation_type</w:t>
-            </w:r>
-            <w:r>
-              <w:rPr>
-                <w:rFonts w:eastAsia="Times New Roman"/>
-              </w:rPr>
-              <w:t xml:space="preserve"> </w:t>
-            </w:r>
-            <w:r>
-              <w:rPr>
-                <w:rFonts w:eastAsia="Times New Roman"/>
-              </w:rPr>
               <w:t xml:space="preserve">= </w:t>
             </w:r>
             <w:r>
@@ -12158,13 +12196,7 @@
               <w:rPr>
                 <w:rFonts w:eastAsia="Times New Roman"/>
               </w:rPr>
-              <w:t xml:space="preserve">type_prestation </w:t>
-            </w:r>
-            <w:r>
-              <w:rPr>
-                <w:rFonts w:eastAsia="Times New Roman"/>
-              </w:rPr>
-              <w:t>='soins curatifs en ambulatoire'</w:t>
+              <w:t>type_prestation ='soins curatifs en ambulatoire'</w:t>
             </w:r>
             <w:r>
               <w:rPr>
@@ -12205,6 +12237,7 @@
             <w:r>
               <w:rPr>
                 <w:rFonts w:eastAsia="Times New Roman"/>
+                <w:highlight w:val="yellow"/>
               </w:rPr>
               <w:t>verifierHospitalisationEtEvacuation</w:t>
             </w:r>
@@ -12323,13 +12356,7 @@
               <w:rPr>
                 <w:rFonts w:eastAsia="Times New Roman"/>
               </w:rPr>
-              <w:t xml:space="preserve">= </w:t>
-            </w:r>
-            <w:r>
-              <w:rPr>
-                <w:rFonts w:eastAsia="Times New Roman"/>
-              </w:rPr>
-              <w:t xml:space="preserve">3 </w:t>
+              <w:t xml:space="preserve">= 3 </w:t>
             </w:r>
             <w:r>
               <w:rPr>
@@ -13338,6 +13365,7 @@
             <w:r>
               <w:rPr>
                 <w:rFonts w:eastAsia="Times New Roman"/>
+                <w:highlight w:val="yellow"/>
               </w:rPr>
               <w:t>verifierMontantEvacuation</w:t>
             </w:r>
@@ -14138,6 +14166,7 @@
             <w:r>
               <w:rPr>
                 <w:rFonts w:eastAsia="Times New Roman"/>
+                <w:highlight w:val="yellow"/>
               </w:rPr>
               <w:lastRenderedPageBreak/>
               <w:t>verifierIncoherenceDateEntree</w:t>
@@ -14256,6 +14285,7 @@
             <w:r>
               <w:rPr>
                 <w:rFonts w:eastAsia="Times New Roman"/>
+                <w:highlight w:val="yellow"/>
               </w:rPr>
               <w:t>verifierIncoherenceDateSortie</w:t>
             </w:r>
@@ -14373,6 +14403,7 @@
             <w:r>
               <w:rPr>
                 <w:rFonts w:eastAsia="Times New Roman"/>
+                <w:highlight w:val="yellow"/>
               </w:rPr>
               <w:t>verifierChevauchementHospitalisation</w:t>
             </w:r>
@@ -14947,6 +14978,7 @@
             <w:r>
               <w:rPr>
                 <w:rFonts w:eastAsia="Times New Roman"/>
+                <w:highlight w:val="yellow"/>
               </w:rPr>
               <w:t>verifierChevauchementHospitalisation</w:t>
             </w:r>
@@ -14996,15 +15028,7 @@
               <w:rPr>
                 <w:rFonts w:eastAsia="Times New Roman"/>
               </w:rPr>
-              <w:t>$hospitalisation1['type_hospi'],                           $hospitalisation1['date_entree'],                        $hospitalisation1['date_sortie'],                               $hospitalisation2['type_hospi'],                               $hospitalisation2['date_entree'],</w:t>
-            </w:r>
-            <w:bookmarkStart w:id="0" w:name="_GoBack"/>
-            <w:bookmarkEnd w:id="0"/>
-            <w:r>
-              <w:rPr>
-                <w:rFonts w:eastAsia="Times New Roman"/>
-              </w:rPr>
-              <w:t xml:space="preserve">                              $hospitalisation2['date_sortie']</w:t>
+              <w:t>$hospitalisation1['type_hospi'],                           $hospitalisation1['date_entree'],                        $hospitalisation1['date_sortie'],                               $hospitalisation2['type_hospi'],                               $hospitalisation2['date_entree'],                              $hospitalisation2['date_sortie']</w:t>
             </w:r>
           </w:p>
         </w:tc>
@@ -15034,13 +15058,7 @@
               <w:rPr>
                 <w:rFonts w:eastAsia="Times New Roman"/>
               </w:rPr>
-              <w:t xml:space="preserve">Si </w:t>
-            </w:r>
-            <w:r>
-              <w:rPr>
-                <w:rFonts w:eastAsia="Times New Roman"/>
-              </w:rPr>
-              <w:t xml:space="preserve"> ($typeFs == 'CHR' || $typeFs == 'CHU') </w:t>
+              <w:t xml:space="preserve">Si  ($typeFs == 'CHR' || $typeFs == 'CHU') </w:t>
             </w:r>
           </w:p>
           <w:p>
@@ -15059,13 +15077,7 @@
               <w:rPr>
                 <w:rFonts w:eastAsia="Times New Roman"/>
               </w:rPr>
-              <w:t>if (!is_null($facture</w:t>
-            </w:r>
-            <w:r>
-              <w:rPr>
-                <w:rFonts w:eastAsia="Times New Roman"/>
-              </w:rPr>
-              <w:t>&gt;type_hospitalisation)) {</w:t>
+              <w:t>if (!is_null($facture&gt;type_hospitalisation)) {</w:t>
             </w:r>
           </w:p>
         </w:tc>

</xml_diff>